<commit_message>
feat: update CV generation and JD search
</commit_message>
<xml_diff>
--- a/backend/template cv/1.docx
+++ b/backend/template cv/1.docx
@@ -63,19 +63,98 @@
       </w:r>
     </w:p>
     <w:p>
+      <w:pPr>
+        <w:tabs>
+          <w:tab w:val="right" w:pos="9360"/>
+        </w:tabs>
+      </w:pPr>
       <w:r>
         <w:rPr>
-          <w:sz w:val="20"/>
+          <w:b/>
         </w:rPr>
-        <w:t>{{EXPERIENCE}}</w:t>
+        <w:t>{{COMPANY}}</w:t>
+      </w:r>
+      <w:r>
+        <w:tab/>
+      </w:r>
+      <w:r>
+        <w:t xml:space="preserve"> </w:t>
+      </w:r>
+      <w:proofErr w:type="gramStart"/>
+      <w:r>
+        <w:t xml:space="preserve">   </w:t>
+      </w:r>
+      <w:r>
+        <w:t>{</w:t>
+      </w:r>
+      <w:proofErr w:type="gramEnd"/>
+      <w:r>
+        <w:t>{TIME}}</w:t>
       </w:r>
     </w:p>
     <w:p>
+      <w:r>
+        <w:t>• {{EXPERIENCE}}</w:t>
+      </w:r>
+    </w:p>
+    <w:p>
+      <w:pPr>
+        <w:rPr>
+          <w:b/>
+        </w:rPr>
+      </w:pPr>
       <w:r>
         <w:rPr>
           <w:b/>
         </w:rPr>
         <w:t>EDUCATION</w:t>
+      </w:r>
+    </w:p>
+    <w:p>
+      <w:pPr>
+        <w:rPr>
+          <w:b/>
+        </w:rPr>
+      </w:pPr>
+      <w:r>
+        <w:rPr>
+          <w:b/>
+        </w:rPr>
+        <w:t>{{SCHOOL</w:t>
+      </w:r>
+      <w:proofErr w:type="gramStart"/>
+      <w:r>
+        <w:rPr>
+          <w:b/>
+        </w:rPr>
+        <w:t xml:space="preserve">}}   </w:t>
+      </w:r>
+      <w:proofErr w:type="gramEnd"/>
+      <w:r>
+        <w:rPr>
+          <w:b/>
+        </w:rPr>
+        <w:t xml:space="preserve">                                                                                                                                                  </w:t>
+      </w:r>
+      <w:proofErr w:type="gramStart"/>
+      <w:r>
+        <w:rPr>
+          <w:b/>
+        </w:rPr>
+        <w:t xml:space="preserve">   </w:t>
+      </w:r>
+      <w:r>
+        <w:rPr>
+          <w:bCs/>
+        </w:rPr>
+        <w:t>{</w:t>
+      </w:r>
+      <w:proofErr w:type="gramEnd"/>
+      <w:r>
+        <w:rPr>
+          <w:bCs/>
+        </w:rPr>
+        <w:t>{TIME}}</w:t>
       </w:r>
     </w:p>
     <w:p>

</xml_diff>